<commit_message>
Update Word template formatting
</commit_message>
<xml_diff>
--- a/templates/Order_Confirmation_Template.docx
+++ b/templates/Order_Confirmation_Template.docx
@@ -5,18 +5,18 @@
     <w:p>
       <w:pPr>
         <w:rPr>
-          <w:rFonts w:ascii="Arial" w:hAnsi="Arial" w:cs="Arial"/>
+          <w:rFonts w:ascii="Calibri" w:hAnsi="Calibri"/>
           <w:b/>
-          <w:sz w:val="28"/>
-          <w:szCs w:val="28"/>
+          <w:color w:val="0000FF"/>
+          <w:sz w:val="36"/>
         </w:rPr>
       </w:pPr>
       <w:r>
         <w:rPr>
-          <w:rFonts w:ascii="Arial" w:hAnsi="Arial" w:cs="Arial"/>
+          <w:rFonts w:ascii="Calibri" w:hAnsi="Calibri"/>
           <w:b/>
-          <w:sz w:val="28"/>
-          <w:szCs w:val="28"/>
+          <w:color w:val="0000FF"/>
+          <w:sz w:val="36"/>
         </w:rPr>
         <w:t>ADVENTURE WORKS CYCLES</w:t>
       </w:r>
@@ -24,250 +24,531 @@
     <w:p>
       <w:pPr>
         <w:rPr>
-          <w:rFonts w:ascii="Arial" w:hAnsi="Arial" w:cs="Arial"/>
-          <w:b/>
-          <w:sz w:val="28"/>
-          <w:szCs w:val="28"/>
+          <w:rFonts w:ascii="Calibri" w:hAnsi="Calibri"/>
+          <w:color w:val="000000" w:themeColor="text1"/>
+          <w:sz w:val="20"/>
         </w:rPr>
       </w:pPr>
       <w:r>
         <w:rPr>
-          <w:rFonts w:ascii="Arial" w:hAnsi="Arial" w:cs="Arial"/>
-          <w:b/>
-          <w:sz w:val="28"/>
-          <w:szCs w:val="28"/>
+          <w:rFonts w:ascii="Calibri" w:hAnsi="Calibri"/>
+          <w:color w:val="000000" w:themeColor="text1"/>
+          <w:sz w:val="20"/>
         </w:rPr>
-        <w:t>ORDER CONFIRMATION</w:t>
+        <w:t>ORDER CONFIRMATION RECEIPT</w:t>
       </w:r>
     </w:p>
     <w:p>
       <w:pPr>
         <w:rPr>
-          <w:rFonts w:ascii="Arial" w:hAnsi="Arial" w:cs="Arial"/>
-          <w:b/>
-          <w:sz w:val="28"/>
-          <w:szCs w:val="28"/>
+          <w:rFonts w:ascii="Calibri" w:hAnsi="Calibri"/>
+          <w:color w:val="C0C0C0"/>
+          <w:sz w:val="20"/>
+        </w:rPr>
+      </w:pPr>
+    </w:p>
+    <w:tbl>
+      <w:tblPr>
+        <w:tblW w:w="0" w:type="auto"/>
+        <w:tblBorders>
+          <w:bottom w:val="single" w:sz="4" w:space="0" w:color="808080"/>
+        </w:tblBorders>
+        <w:tblLayout w:type="fixed"/>
+        <w:tblLook w:val="0000" w:firstRow="0" w:lastRow="0" w:firstColumn="0" w:lastColumn="0" w:noHBand="0" w:noVBand="0"/>
+      </w:tblPr>
+      <w:tblGrid>
+        <w:gridCol w:w="2600"/>
+        <w:gridCol w:w="6600"/>
+      </w:tblGrid>
+      <w:tr>
+        <w:tc>
+          <w:tcPr>
+            <w:tcW w:w="2600" w:type="dxa"/>
+          </w:tcPr>
+          <w:p>
+            <w:pPr>
+              <w:rPr>
+                <w:rFonts w:ascii="Calibri" w:hAnsi="Calibri" w:cs="Calibri"/>
+                <w:b/>
+                <w:color w:val="000000"/>
+                <w:sz w:val="22"/>
+              </w:rPr>
+            </w:pPr>
+            <w:r>
+              <w:rPr>
+                <w:rFonts w:ascii="Calibri" w:hAnsi="Calibri" w:cs="Calibri"/>
+                <w:b/>
+                <w:color w:val="000000"/>
+                <w:sz w:val="22"/>
+              </w:rPr>
+              <w:t>Order ID:</w:t>
+            </w:r>
+          </w:p>
+        </w:tc>
+        <w:tc>
+          <w:tcPr>
+            <w:tcW w:w="6600" w:type="dxa"/>
+          </w:tcPr>
+          <w:p>
+            <w:pPr>
+              <w:rPr>
+                <w:rFonts w:ascii="Calibri" w:hAnsi="Calibri" w:cs="Calibri"/>
+                <w:color w:val="000000"/>
+                <w:sz w:val="22"/>
+              </w:rPr>
+            </w:pPr>
+            <w:r>
+              <w:rPr>
+                <w:rFonts w:ascii="Calibri" w:hAnsi="Calibri" w:cs="Calibri"/>
+                <w:color w:val="000000"/>
+                <w:sz w:val="22"/>
+              </w:rPr>
+              <w:fldChar w:fldCharType="begin"/>
+            </w:r>
+            <w:r>
+              <w:rPr>
+                <w:rFonts w:ascii="Calibri" w:hAnsi="Calibri" w:cs="Calibri"/>
+                <w:color w:val="000000"/>
+                <w:sz w:val="22"/>
+              </w:rPr>
+              <w:instrText xml:space="preserve"> MERGEFIELD SalesOrderID \* MERGEFORMAT </w:instrText>
+            </w:r>
+            <w:r>
+              <w:rPr>
+                <w:rFonts w:ascii="Calibri" w:hAnsi="Calibri" w:cs="Calibri"/>
+                <w:color w:val="000000"/>
+                <w:sz w:val="22"/>
+              </w:rPr>
+              <w:fldChar w:fldCharType="separate"/>
+            </w:r>
+            <w:r>
+              <w:rPr>
+                <w:rFonts w:ascii="Calibri" w:hAnsi="Calibri" w:cs="Calibri"/>
+                <w:noProof/>
+                <w:color w:val="000000"/>
+                <w:sz w:val="22"/>
+              </w:rPr>
+              <w:t>43659</w:t>
+            </w:r>
+            <w:r>
+              <w:rPr>
+                <w:rFonts w:ascii="Calibri" w:hAnsi="Calibri" w:cs="Calibri"/>
+                <w:color w:val="000000"/>
+                <w:sz w:val="22"/>
+              </w:rPr>
+              <w:fldChar w:fldCharType="end"/>
+            </w:r>
+          </w:p>
+        </w:tc>
+      </w:tr>
+      <w:tr>
+        <w:tc>
+          <w:tcPr>
+            <w:tcW w:w="2600" w:type="dxa"/>
+          </w:tcPr>
+          <w:p>
+            <w:pPr>
+              <w:rPr>
+                <w:rFonts w:ascii="Calibri" w:hAnsi="Calibri" w:cs="Calibri"/>
+                <w:b/>
+                <w:color w:val="000000"/>
+                <w:sz w:val="22"/>
+              </w:rPr>
+            </w:pPr>
+            <w:r>
+              <w:rPr>
+                <w:rFonts w:ascii="Calibri" w:hAnsi="Calibri" w:cs="Calibri"/>
+                <w:b/>
+                <w:color w:val="000000"/>
+                <w:sz w:val="22"/>
+              </w:rPr>
+              <w:t>Order Date:</w:t>
+            </w:r>
+          </w:p>
+        </w:tc>
+        <w:tc>
+          <w:tcPr>
+            <w:tcW w:w="6600" w:type="dxa"/>
+          </w:tcPr>
+          <w:p>
+            <w:pPr>
+              <w:rPr>
+                <w:rFonts w:ascii="Calibri" w:hAnsi="Calibri" w:cs="Calibri"/>
+                <w:color w:val="000000"/>
+                <w:sz w:val="22"/>
+              </w:rPr>
+            </w:pPr>
+            <w:r>
+              <w:rPr>
+                <w:rFonts w:ascii="Calibri" w:hAnsi="Calibri" w:cs="Calibri"/>
+                <w:color w:val="000000"/>
+                <w:sz w:val="22"/>
+              </w:rPr>
+              <w:fldChar w:fldCharType="begin"/>
+            </w:r>
+            <w:r>
+              <w:rPr>
+                <w:rFonts w:ascii="Calibri" w:hAnsi="Calibri" w:cs="Calibri"/>
+                <w:color w:val="000000"/>
+                <w:sz w:val="22"/>
+              </w:rPr>
+              <w:instrText xml:space="preserve"> MERGEFIELD OrderDate \@ "MMMM d, yyyy" \* MERGEFORMAT </w:instrText>
+            </w:r>
+            <w:r>
+              <w:rPr>
+                <w:rFonts w:ascii="Calibri" w:hAnsi="Calibri" w:cs="Calibri"/>
+                <w:color w:val="000000"/>
+                <w:sz w:val="22"/>
+              </w:rPr>
+              <w:fldChar w:fldCharType="separate"/>
+            </w:r>
+            <w:r>
+              <w:rPr>
+                <w:rFonts w:ascii="Calibri" w:hAnsi="Calibri" w:cs="Calibri"/>
+                <w:noProof/>
+                <w:color w:val="000000"/>
+                <w:sz w:val="22"/>
+              </w:rPr>
+              <w:t>September 15, 2026</w:t>
+            </w:r>
+            <w:r>
+              <w:rPr>
+                <w:rFonts w:ascii="Calibri" w:hAnsi="Calibri" w:cs="Calibri"/>
+                <w:color w:val="000000"/>
+                <w:sz w:val="22"/>
+              </w:rPr>
+              <w:fldChar w:fldCharType="end"/>
+            </w:r>
+          </w:p>
+        </w:tc>
+      </w:tr>
+      <w:tr>
+        <w:tc>
+          <w:tcPr>
+            <w:tcW w:w="2600" w:type="dxa"/>
+          </w:tcPr>
+          <w:p>
+            <w:pPr>
+              <w:rPr>
+                <w:rFonts w:ascii="Calibri" w:hAnsi="Calibri" w:cs="Calibri"/>
+                <w:b/>
+                <w:color w:val="000000"/>
+                <w:sz w:val="22"/>
+              </w:rPr>
+            </w:pPr>
+            <w:r>
+              <w:rPr>
+                <w:rFonts w:ascii="Calibri" w:hAnsi="Calibri" w:cs="Calibri"/>
+                <w:b/>
+                <w:color w:val="000000"/>
+                <w:sz w:val="22"/>
+              </w:rPr>
+              <w:t>Customer Name:</w:t>
+            </w:r>
+          </w:p>
+        </w:tc>
+        <w:tc>
+          <w:tcPr>
+            <w:tcW w:w="6600" w:type="dxa"/>
+          </w:tcPr>
+          <w:p>
+            <w:pPr>
+              <w:rPr>
+                <w:rFonts w:ascii="Calibri" w:hAnsi="Calibri" w:cs="Calibri"/>
+                <w:color w:val="000000"/>
+                <w:sz w:val="22"/>
+              </w:rPr>
+            </w:pPr>
+            <w:r>
+              <w:rPr>
+                <w:rFonts w:ascii="Calibri" w:hAnsi="Calibri" w:cs="Calibri"/>
+                <w:color w:val="000000"/>
+                <w:sz w:val="22"/>
+              </w:rPr>
+              <w:fldChar w:fldCharType="begin"/>
+            </w:r>
+            <w:r>
+              <w:rPr>
+                <w:rFonts w:ascii="Calibri" w:hAnsi="Calibri" w:cs="Calibri"/>
+                <w:color w:val="000000"/>
+                <w:sz w:val="22"/>
+              </w:rPr>
+              <w:instrText xml:space="preserve"> MERGEFIELD CustomerName \* MERGEFORMAT </w:instrText>
+            </w:r>
+            <w:r>
+              <w:rPr>
+                <w:rFonts w:ascii="Calibri" w:hAnsi="Calibri" w:cs="Calibri"/>
+                <w:color w:val="000000"/>
+                <w:sz w:val="22"/>
+              </w:rPr>
+              <w:fldChar w:fldCharType="separate"/>
+            </w:r>
+            <w:r>
+              <w:rPr>
+                <w:rFonts w:ascii="Calibri" w:hAnsi="Calibri" w:cs="Calibri"/>
+                <w:noProof/>
+                <w:color w:val="000000"/>
+                <w:sz w:val="22"/>
+              </w:rPr>
+              <w:t>Jordan, Gustavo</w:t>
+            </w:r>
+            <w:r>
+              <w:rPr>
+                <w:rFonts w:ascii="Calibri" w:hAnsi="Calibri" w:cs="Calibri"/>
+                <w:color w:val="000000"/>
+                <w:sz w:val="22"/>
+              </w:rPr>
+              <w:fldChar w:fldCharType="end"/>
+            </w:r>
+          </w:p>
+        </w:tc>
+      </w:tr>
+      <w:tr>
+        <w:tc>
+          <w:tcPr>
+            <w:tcW w:w="2600" w:type="dxa"/>
+          </w:tcPr>
+          <w:p>
+            <w:pPr>
+              <w:rPr>
+                <w:rFonts w:ascii="Calibri" w:hAnsi="Calibri" w:cs="Calibri"/>
+                <w:b/>
+                <w:color w:val="000000"/>
+                <w:sz w:val="22"/>
+              </w:rPr>
+            </w:pPr>
+            <w:r>
+              <w:rPr>
+                <w:rFonts w:ascii="Calibri" w:hAnsi="Calibri" w:cs="Calibri"/>
+                <w:b/>
+                <w:color w:val="000000"/>
+                <w:sz w:val="22"/>
+              </w:rPr>
+              <w:t>Order Type:</w:t>
+            </w:r>
+          </w:p>
+        </w:tc>
+        <w:tc>
+          <w:tcPr>
+            <w:tcW w:w="6600" w:type="dxa"/>
+          </w:tcPr>
+          <w:p>
+            <w:pPr>
+              <w:rPr>
+                <w:rFonts w:ascii="Calibri" w:hAnsi="Calibri" w:cs="Calibri"/>
+                <w:color w:val="000000"/>
+                <w:sz w:val="22"/>
+              </w:rPr>
+            </w:pPr>
+            <w:r>
+              <w:rPr>
+                <w:rFonts w:ascii="Calibri" w:hAnsi="Calibri" w:cs="Calibri"/>
+                <w:color w:val="000000"/>
+                <w:sz w:val="22"/>
+              </w:rPr>
+              <w:fldChar w:fldCharType="begin"/>
+            </w:r>
+            <w:r>
+              <w:rPr>
+                <w:rFonts w:ascii="Calibri" w:hAnsi="Calibri" w:cs="Calibri"/>
+                <w:color w:val="000000"/>
+                <w:sz w:val="22"/>
+              </w:rPr>
+              <w:instrText xml:space="preserve"> MERGEFIELD OrderType \* MERGEFORMAT </w:instrText>
+            </w:r>
+            <w:r>
+              <w:rPr>
+                <w:rFonts w:ascii="Calibri" w:hAnsi="Calibri" w:cs="Calibri"/>
+                <w:color w:val="000000"/>
+                <w:sz w:val="22"/>
+              </w:rPr>
+              <w:fldChar w:fldCharType="separate"/>
+            </w:r>
+            <w:r>
+              <w:rPr>
+                <w:rFonts w:ascii="Calibri" w:hAnsi="Calibri" w:cs="Calibri"/>
+                <w:noProof/>
+                <w:color w:val="000000"/>
+                <w:sz w:val="22"/>
+              </w:rPr>
+              <w:t>Reseller</w:t>
+            </w:r>
+            <w:r>
+              <w:rPr>
+                <w:rFonts w:ascii="Calibri" w:hAnsi="Calibri" w:cs="Calibri"/>
+                <w:color w:val="000000"/>
+                <w:sz w:val="22"/>
+              </w:rPr>
+              <w:fldChar w:fldCharType="end"/>
+            </w:r>
+          </w:p>
+        </w:tc>
+      </w:tr>
+      <w:tr>
+        <w:tc>
+          <w:tcPr>
+            <w:tcW w:w="2600" w:type="dxa"/>
+          </w:tcPr>
+          <w:p>
+            <w:pPr>
+              <w:rPr>
+                <w:rFonts w:ascii="Calibri" w:hAnsi="Calibri" w:cs="Calibri"/>
+                <w:b/>
+                <w:color w:val="000000"/>
+                <w:sz w:val="22"/>
+              </w:rPr>
+            </w:pPr>
+            <w:r>
+              <w:rPr>
+                <w:rFonts w:ascii="Calibri" w:hAnsi="Calibri" w:cs="Calibri"/>
+                <w:b/>
+                <w:color w:val="000000"/>
+                <w:sz w:val="22"/>
+              </w:rPr>
+              <w:t>Total Due:</w:t>
+            </w:r>
+          </w:p>
+        </w:tc>
+        <w:tc>
+          <w:tcPr>
+            <w:tcW w:w="6600" w:type="dxa"/>
+          </w:tcPr>
+          <w:p>
+            <w:pPr>
+              <w:rPr>
+                <w:rFonts w:ascii="Calibri" w:hAnsi="Calibri" w:cs="Calibri"/>
+                <w:color w:val="000000"/>
+                <w:sz w:val="22"/>
+              </w:rPr>
+            </w:pPr>
+            <w:r>
+              <w:rPr>
+                <w:rFonts w:ascii="Calibri" w:hAnsi="Calibri" w:cs="Calibri"/>
+                <w:color w:val="000000"/>
+                <w:sz w:val="22"/>
+              </w:rPr>
+              <w:fldChar w:fldCharType="begin"/>
+            </w:r>
+            <w:r>
+              <w:rPr>
+                <w:rFonts w:ascii="Calibri" w:hAnsi="Calibri" w:cs="Calibri"/>
+                <w:color w:val="000000"/>
+                <w:sz w:val="22"/>
+              </w:rPr>
+              <w:instrText xml:space="preserve"> MERGEFIELD TotalDue \# "$#,##0.00" \* MERGEFORMAT </w:instrText>
+            </w:r>
+            <w:r>
+              <w:rPr>
+                <w:rFonts w:ascii="Calibri" w:hAnsi="Calibri" w:cs="Calibri"/>
+                <w:color w:val="000000"/>
+                <w:sz w:val="22"/>
+              </w:rPr>
+              <w:fldChar w:fldCharType="separate"/>
+            </w:r>
+            <w:r>
+              <w:rPr>
+                <w:rFonts w:ascii="Calibri" w:hAnsi="Calibri" w:cs="Calibri"/>
+                <w:noProof/>
+                <w:color w:val="000000"/>
+                <w:sz w:val="22"/>
+              </w:rPr>
+              <w:t>$20,565.18</w:t>
+            </w:r>
+            <w:r>
+              <w:rPr>
+                <w:rFonts w:ascii="Calibri" w:hAnsi="Calibri" w:cs="Calibri"/>
+                <w:color w:val="000000"/>
+                <w:sz w:val="22"/>
+              </w:rPr>
+              <w:fldChar w:fldCharType="end"/>
+            </w:r>
+          </w:p>
+        </w:tc>
+      </w:tr>
+    </w:tbl>
+    <w:p>
+      <w:pPr>
+        <w:rPr>
+          <w:rFonts w:ascii="Calibri" w:hAnsi="Calibri"/>
+          <w:color w:val="C0C0C0"/>
+          <w:sz w:val="20"/>
         </w:rPr>
       </w:pPr>
     </w:p>
     <w:p>
       <w:pPr>
         <w:rPr>
-          <w:rFonts w:ascii="Arial" w:hAnsi="Arial" w:cs="Arial"/>
-          <w:b/>
-          <w:sz w:val="28"/>
-          <w:szCs w:val="28"/>
-        </w:rPr>
-      </w:pPr>
-      <w:r>
-        <w:rPr>
-          <w:rFonts w:ascii="Arial" w:hAnsi="Arial" w:cs="Arial"/>
-          <w:b/>
-          <w:sz w:val="28"/>
-          <w:szCs w:val="28"/>
-        </w:rPr>
-        <w:t>ADVENTURE WORKS CYCLES</w:t>
-      </w:r>
-    </w:p>
-    <w:p>
-      <w:pPr>
-        <w:rPr>
-          <w:rFonts w:ascii="Arial" w:hAnsi="Arial" w:cs="Arial"/>
-          <w:b/>
-          <w:sz w:val="28"/>
-          <w:szCs w:val="28"/>
-        </w:rPr>
-      </w:pPr>
-      <w:r>
-        <w:rPr>
-          <w:rFonts w:ascii="Arial" w:hAnsi="Arial" w:cs="Arial"/>
-          <w:b/>
-          <w:sz w:val="28"/>
-          <w:szCs w:val="28"/>
-        </w:rPr>
-        <w:t>ORDER CONFIRMATION</w:t>
-      </w:r>
-    </w:p>
-    <w:p>
-      <w:pPr>
-        <w:rPr>
-          <w:rFonts w:ascii="Arial" w:hAnsi="Arial" w:cs="Arial"/>
-          <w:b/>
-          <w:sz w:val="28"/>
-          <w:szCs w:val="28"/>
+          <w:rFonts w:ascii="Calibri" w:hAnsi="Calibri"/>
+          <w:color w:val="C0C0C0"/>
+          <w:sz w:val="20"/>
         </w:rPr>
       </w:pPr>
     </w:p>
     <w:p>
       <w:pPr>
         <w:rPr>
-          <w:rFonts w:ascii="Arial" w:hAnsi="Arial" w:cs="Arial"/>
+          <w:rFonts w:ascii="Calibri" w:hAnsi="Calibri" w:cs="Calibri"/>
+          <w:b/>
+          <w:color w:val="0000FF"/>
           <w:sz w:val="22"/>
-          <w:szCs w:val="22"/>
         </w:rPr>
       </w:pPr>
       <w:r>
         <w:rPr>
-          <w:rFonts w:ascii="Arial" w:hAnsi="Arial" w:cs="Arial"/>
+          <w:rFonts w:ascii="Calibri" w:hAnsi="Calibri" w:cs="Calibri"/>
+          <w:b/>
+          <w:color w:val="0000FF"/>
           <w:sz w:val="22"/>
-          <w:szCs w:val="22"/>
         </w:rPr>
-        <w:t xml:space="preserve">Order ID: </w:t>
+        <w:t>Payment &amp; Remittance Terms:</w:t>
       </w:r>
+    </w:p>
+    <w:p>
+      <w:pPr>
+        <w:rPr>
+          <w:rFonts w:ascii="Calibri" w:hAnsi="Calibri" w:cs="Calibri"/>
+          <w:color w:val="000000"/>
+          <w:sz w:val="22"/>
+        </w:rPr>
+      </w:pPr>
       <w:r>
         <w:rPr>
-          <w:rFonts w:ascii="Arial" w:hAnsi="Arial" w:cs="Arial"/>
+          <w:rFonts w:ascii="Calibri" w:hAnsi="Calibri" w:cs="Calibri"/>
+          <w:color w:val="000000"/>
           <w:sz w:val="22"/>
-          <w:szCs w:val="22"/>
         </w:rPr>
         <w:fldChar w:fldCharType="begin"/>
       </w:r>
       <w:r>
         <w:rPr>
-          <w:rFonts w:ascii="Arial" w:hAnsi="Arial" w:cs="Arial"/>
+          <w:rFonts w:ascii="Calibri" w:hAnsi="Calibri" w:cs="Calibri"/>
+          <w:color w:val="000000"/>
           <w:sz w:val="22"/>
-          <w:szCs w:val="22"/>
         </w:rPr>
-        <w:instrText xml:space="preserve"> MERGEFIELD MERGEFIELD SalesOrderID \* MERGEFORMAT </w:instrText>
+        <w:instrText xml:space="preserve"> IF "{ MERGEFIELD OrderType }" = "Online" "Payment processed via customer portal." "Invoice Terms: Net 30 Days. Remit payment to Accounts Receivable." \* MERGEFORMAT </w:instrText>
       </w:r>
       <w:r>
         <w:rPr>
-          <w:rFonts w:ascii="Arial" w:hAnsi="Arial" w:cs="Arial"/>
+          <w:rFonts w:ascii="Calibri" w:hAnsi="Calibri" w:cs="Calibri"/>
+          <w:color w:val="000000"/>
           <w:sz w:val="22"/>
-          <w:szCs w:val="22"/>
         </w:rPr>
         <w:fldChar w:fldCharType="separate"/>
       </w:r>
       <w:r>
         <w:rPr>
-          <w:rFonts w:ascii="Arial" w:hAnsi="Arial" w:cs="Arial"/>
+          <w:rFonts w:ascii="Calibri" w:hAnsi="Calibri" w:cs="Calibri"/>
           <w:noProof/>
+          <w:color w:val="000000"/>
           <w:sz w:val="22"/>
-          <w:szCs w:val="22"/>
         </w:rPr>
-        <w:t>«MERGEFIELD»</w:t>
+        <w:t>Invoice Terms: Net 30 Days. Remit payment to Accounts Receivable.</w:t>
       </w:r>
       <w:r>
         <w:rPr>
-          <w:rFonts w:ascii="Arial" w:hAnsi="Arial" w:cs="Arial"/>
+          <w:rFonts w:ascii="Calibri" w:hAnsi="Calibri" w:cs="Calibri"/>
+          <w:color w:val="000000"/>
           <w:sz w:val="22"/>
-          <w:szCs w:val="22"/>
-        </w:rPr>
-        <w:fldChar w:fldCharType="end"/>
-      </w:r>
-    </w:p>
-    <w:p>
-      <w:pPr>
-        <w:rPr>
-          <w:rFonts w:ascii="Arial" w:hAnsi="Arial" w:cs="Arial"/>
-          <w:sz w:val="22"/>
-          <w:szCs w:val="22"/>
-        </w:rPr>
-      </w:pPr>
-      <w:r>
-        <w:rPr>
-          <w:rFonts w:ascii="Arial" w:hAnsi="Arial" w:cs="Arial"/>
-          <w:sz w:val="22"/>
-          <w:szCs w:val="22"/>
-        </w:rPr>
-        <w:t xml:space="preserve">Customer Name: </w:t>
-      </w:r>
-      <w:r>
-        <w:rPr>
-          <w:rFonts w:ascii="Arial" w:hAnsi="Arial" w:cs="Arial"/>
-          <w:sz w:val="22"/>
-          <w:szCs w:val="22"/>
-        </w:rPr>
-        <w:fldChar w:fldCharType="begin"/>
-      </w:r>
-      <w:r>
-        <w:rPr>
-          <w:rFonts w:ascii="Arial" w:hAnsi="Arial" w:cs="Arial"/>
-          <w:sz w:val="22"/>
-          <w:szCs w:val="22"/>
-        </w:rPr>
-        <w:instrText xml:space="preserve"> MERGEFIELD MERGEFIELD CustomerName \* MERGEFORMAT </w:instrText>
-      </w:r>
-      <w:r>
-        <w:rPr>
-          <w:rFonts w:ascii="Arial" w:hAnsi="Arial" w:cs="Arial"/>
-          <w:sz w:val="22"/>
-          <w:szCs w:val="22"/>
-        </w:rPr>
-        <w:fldChar w:fldCharType="separate"/>
-      </w:r>
-      <w:r>
-        <w:rPr>
-          <w:rFonts w:ascii="Arial" w:hAnsi="Arial" w:cs="Arial"/>
-          <w:noProof/>
-          <w:sz w:val="22"/>
-          <w:szCs w:val="22"/>
-        </w:rPr>
-        <w:t>«MERGEFIELD»</w:t>
-      </w:r>
-      <w:r>
-        <w:rPr>
-          <w:rFonts w:ascii="Arial" w:hAnsi="Arial" w:cs="Arial"/>
-          <w:sz w:val="22"/>
-          <w:szCs w:val="22"/>
-        </w:rPr>
-        <w:fldChar w:fldCharType="end"/>
-      </w:r>
-    </w:p>
-    <w:p>
-      <w:pPr>
-        <w:rPr>
-          <w:rFonts w:ascii="Arial" w:hAnsi="Arial" w:cs="Arial"/>
-          <w:sz w:val="22"/>
-          <w:szCs w:val="22"/>
-        </w:rPr>
-      </w:pPr>
-      <w:r>
-        <w:rPr>
-          <w:rFonts w:ascii="Arial" w:hAnsi="Arial" w:cs="Arial"/>
-          <w:sz w:val="22"/>
-          <w:szCs w:val="22"/>
-        </w:rPr>
-        <w:t xml:space="preserve">Total Due: </w:t>
-      </w:r>
-      <w:r>
-        <w:rPr>
-          <w:rFonts w:ascii="Arial" w:hAnsi="Arial" w:cs="Arial"/>
-          <w:sz w:val="22"/>
-          <w:szCs w:val="22"/>
-        </w:rPr>
-        <w:fldChar w:fldCharType="begin"/>
-      </w:r>
-      <w:r>
-        <w:rPr>
-          <w:rFonts w:ascii="Arial" w:hAnsi="Arial" w:cs="Arial"/>
-          <w:sz w:val="22"/>
-          <w:szCs w:val="22"/>
-        </w:rPr>
-        <w:instrText xml:space="preserve"> MERGEFIELD MERGEFIELD TotalDue \# "$#,##0.00" \* MERGEFORMAT </w:instrText>
-      </w:r>
-      <w:r>
-        <w:rPr>
-          <w:rFonts w:ascii="Arial" w:hAnsi="Arial" w:cs="Arial"/>
-          <w:sz w:val="22"/>
-          <w:szCs w:val="22"/>
-        </w:rPr>
-        <w:fldChar w:fldCharType="separate"/>
-      </w:r>
-      <w:r>
-        <w:rPr>
-          <w:rFonts w:ascii="Arial" w:hAnsi="Arial" w:cs="Arial"/>
-          <w:noProof/>
-          <w:sz w:val="22"/>
-          <w:szCs w:val="22"/>
-        </w:rPr>
-        <w:t>«MERGEFIELD»</w:t>
-      </w:r>
-      <w:r>
-        <w:rPr>
-          <w:rFonts w:ascii="Arial" w:hAnsi="Arial" w:cs="Arial"/>
-          <w:sz w:val="22"/>
-          <w:szCs w:val="22"/>
         </w:rPr>
         <w:fldChar w:fldCharType="end"/>
       </w:r>
@@ -690,7 +971,7 @@
     <w:link w:val="Heading1Char"/>
     <w:uiPriority w:val="9"/>
     <w:qFormat/>
-    <w:rsid w:val="00CD6AB7"/>
+    <w:rsid w:val="00DC4C52"/>
     <w:pPr>
       <w:keepNext/>
       <w:keepLines/>
@@ -713,7 +994,7 @@
     <w:semiHidden/>
     <w:unhideWhenUsed/>
     <w:qFormat/>
-    <w:rsid w:val="00CD6AB7"/>
+    <w:rsid w:val="00DC4C52"/>
     <w:pPr>
       <w:keepNext/>
       <w:keepLines/>
@@ -736,7 +1017,7 @@
     <w:semiHidden/>
     <w:unhideWhenUsed/>
     <w:qFormat/>
-    <w:rsid w:val="00CD6AB7"/>
+    <w:rsid w:val="00DC4C52"/>
     <w:pPr>
       <w:keepNext/>
       <w:keepLines/>
@@ -759,7 +1040,7 @@
     <w:semiHidden/>
     <w:unhideWhenUsed/>
     <w:qFormat/>
-    <w:rsid w:val="00CD6AB7"/>
+    <w:rsid w:val="00DC4C52"/>
     <w:pPr>
       <w:keepNext/>
       <w:keepLines/>
@@ -782,7 +1063,7 @@
     <w:semiHidden/>
     <w:unhideWhenUsed/>
     <w:qFormat/>
-    <w:rsid w:val="00CD6AB7"/>
+    <w:rsid w:val="00DC4C52"/>
     <w:pPr>
       <w:keepNext/>
       <w:keepLines/>
@@ -803,7 +1084,7 @@
     <w:semiHidden/>
     <w:unhideWhenUsed/>
     <w:qFormat/>
-    <w:rsid w:val="00CD6AB7"/>
+    <w:rsid w:val="00DC4C52"/>
     <w:pPr>
       <w:keepNext/>
       <w:keepLines/>
@@ -826,7 +1107,7 @@
     <w:semiHidden/>
     <w:unhideWhenUsed/>
     <w:qFormat/>
-    <w:rsid w:val="00CD6AB7"/>
+    <w:rsid w:val="00DC4C52"/>
     <w:pPr>
       <w:keepNext/>
       <w:keepLines/>
@@ -847,7 +1128,7 @@
     <w:semiHidden/>
     <w:unhideWhenUsed/>
     <w:qFormat/>
-    <w:rsid w:val="00CD6AB7"/>
+    <w:rsid w:val="00DC4C52"/>
     <w:pPr>
       <w:keepNext/>
       <w:keepLines/>
@@ -870,7 +1151,7 @@
     <w:semiHidden/>
     <w:unhideWhenUsed/>
     <w:qFormat/>
-    <w:rsid w:val="00CD6AB7"/>
+    <w:rsid w:val="00DC4C52"/>
     <w:pPr>
       <w:keepNext/>
       <w:keepLines/>
@@ -914,7 +1195,7 @@
     <w:basedOn w:val="DefaultParagraphFont"/>
     <w:link w:val="Heading1"/>
     <w:uiPriority w:val="9"/>
-    <w:rsid w:val="00CD6AB7"/>
+    <w:rsid w:val="00DC4C52"/>
     <w:rPr>
       <w:rFonts w:asciiTheme="majorHAnsi" w:eastAsiaTheme="majorEastAsia" w:hAnsiTheme="majorHAnsi" w:cstheme="majorBidi"/>
       <w:color w:val="0F4761" w:themeColor="accent1" w:themeShade="BF"/>
@@ -928,7 +1209,7 @@
     <w:link w:val="Heading2"/>
     <w:uiPriority w:val="9"/>
     <w:semiHidden/>
-    <w:rsid w:val="00CD6AB7"/>
+    <w:rsid w:val="00DC4C52"/>
     <w:rPr>
       <w:rFonts w:asciiTheme="majorHAnsi" w:eastAsiaTheme="majorEastAsia" w:hAnsiTheme="majorHAnsi" w:cstheme="majorBidi"/>
       <w:color w:val="0F4761" w:themeColor="accent1" w:themeShade="BF"/>
@@ -942,7 +1223,7 @@
     <w:link w:val="Heading3"/>
     <w:uiPriority w:val="9"/>
     <w:semiHidden/>
-    <w:rsid w:val="00CD6AB7"/>
+    <w:rsid w:val="00DC4C52"/>
     <w:rPr>
       <w:rFonts w:eastAsiaTheme="majorEastAsia" w:cstheme="majorBidi"/>
       <w:color w:val="0F4761" w:themeColor="accent1" w:themeShade="BF"/>
@@ -956,7 +1237,7 @@
     <w:link w:val="Heading4"/>
     <w:uiPriority w:val="9"/>
     <w:semiHidden/>
-    <w:rsid w:val="00CD6AB7"/>
+    <w:rsid w:val="00DC4C52"/>
     <w:rPr>
       <w:rFonts w:eastAsiaTheme="majorEastAsia" w:cstheme="majorBidi"/>
       <w:i/>
@@ -970,7 +1251,7 @@
     <w:link w:val="Heading5"/>
     <w:uiPriority w:val="9"/>
     <w:semiHidden/>
-    <w:rsid w:val="00CD6AB7"/>
+    <w:rsid w:val="00DC4C52"/>
     <w:rPr>
       <w:rFonts w:eastAsiaTheme="majorEastAsia" w:cstheme="majorBidi"/>
       <w:color w:val="0F4761" w:themeColor="accent1" w:themeShade="BF"/>
@@ -982,7 +1263,7 @@
     <w:link w:val="Heading6"/>
     <w:uiPriority w:val="9"/>
     <w:semiHidden/>
-    <w:rsid w:val="00CD6AB7"/>
+    <w:rsid w:val="00DC4C52"/>
     <w:rPr>
       <w:rFonts w:eastAsiaTheme="majorEastAsia" w:cstheme="majorBidi"/>
       <w:i/>
@@ -996,7 +1277,7 @@
     <w:link w:val="Heading7"/>
     <w:uiPriority w:val="9"/>
     <w:semiHidden/>
-    <w:rsid w:val="00CD6AB7"/>
+    <w:rsid w:val="00DC4C52"/>
     <w:rPr>
       <w:rFonts w:eastAsiaTheme="majorEastAsia" w:cstheme="majorBidi"/>
       <w:color w:val="595959" w:themeColor="text1" w:themeTint="A6"/>
@@ -1008,7 +1289,7 @@
     <w:link w:val="Heading8"/>
     <w:uiPriority w:val="9"/>
     <w:semiHidden/>
-    <w:rsid w:val="00CD6AB7"/>
+    <w:rsid w:val="00DC4C52"/>
     <w:rPr>
       <w:rFonts w:eastAsiaTheme="majorEastAsia" w:cstheme="majorBidi"/>
       <w:i/>
@@ -1022,7 +1303,7 @@
     <w:link w:val="Heading9"/>
     <w:uiPriority w:val="9"/>
     <w:semiHidden/>
-    <w:rsid w:val="00CD6AB7"/>
+    <w:rsid w:val="00DC4C52"/>
     <w:rPr>
       <w:rFonts w:eastAsiaTheme="majorEastAsia" w:cstheme="majorBidi"/>
       <w:color w:val="272727" w:themeColor="text1" w:themeTint="D8"/>
@@ -1035,7 +1316,7 @@
     <w:link w:val="TitleChar"/>
     <w:uiPriority w:val="10"/>
     <w:qFormat/>
-    <w:rsid w:val="00CD6AB7"/>
+    <w:rsid w:val="00DC4C52"/>
     <w:pPr>
       <w:spacing w:after="80" w:line="240" w:lineRule="auto"/>
       <w:contextualSpacing/>
@@ -1053,7 +1334,7 @@
     <w:basedOn w:val="DefaultParagraphFont"/>
     <w:link w:val="Title"/>
     <w:uiPriority w:val="10"/>
-    <w:rsid w:val="00CD6AB7"/>
+    <w:rsid w:val="00DC4C52"/>
     <w:rPr>
       <w:rFonts w:asciiTheme="majorHAnsi" w:eastAsiaTheme="majorEastAsia" w:hAnsiTheme="majorHAnsi" w:cstheme="majorBidi"/>
       <w:spacing w:val="-10"/>
@@ -1069,7 +1350,7 @@
     <w:link w:val="SubtitleChar"/>
     <w:uiPriority w:val="11"/>
     <w:qFormat/>
-    <w:rsid w:val="00CD6AB7"/>
+    <w:rsid w:val="00DC4C52"/>
     <w:pPr>
       <w:numPr>
         <w:ilvl w:val="1"/>
@@ -1088,7 +1369,7 @@
     <w:basedOn w:val="DefaultParagraphFont"/>
     <w:link w:val="Subtitle"/>
     <w:uiPriority w:val="11"/>
-    <w:rsid w:val="00CD6AB7"/>
+    <w:rsid w:val="00DC4C52"/>
     <w:rPr>
       <w:rFonts w:eastAsiaTheme="majorEastAsia" w:cstheme="majorBidi"/>
       <w:color w:val="595959" w:themeColor="text1" w:themeTint="A6"/>
@@ -1104,7 +1385,7 @@
     <w:link w:val="QuoteChar"/>
     <w:uiPriority w:val="29"/>
     <w:qFormat/>
-    <w:rsid w:val="00CD6AB7"/>
+    <w:rsid w:val="00DC4C52"/>
     <w:pPr>
       <w:spacing w:before="160"/>
       <w:jc w:val="center"/>
@@ -1120,7 +1401,7 @@
     <w:basedOn w:val="DefaultParagraphFont"/>
     <w:link w:val="Quote"/>
     <w:uiPriority w:val="29"/>
-    <w:rsid w:val="00CD6AB7"/>
+    <w:rsid w:val="00DC4C52"/>
     <w:rPr>
       <w:i/>
       <w:iCs/>
@@ -1132,7 +1413,7 @@
     <w:basedOn w:val="Normal"/>
     <w:uiPriority w:val="34"/>
     <w:qFormat/>
-    <w:rsid w:val="00CD6AB7"/>
+    <w:rsid w:val="00DC4C52"/>
     <w:pPr>
       <w:ind w:left="720"/>
       <w:contextualSpacing/>
@@ -1143,7 +1424,7 @@
     <w:basedOn w:val="DefaultParagraphFont"/>
     <w:uiPriority w:val="21"/>
     <w:qFormat/>
-    <w:rsid w:val="00CD6AB7"/>
+    <w:rsid w:val="00DC4C52"/>
     <w:rPr>
       <w:i/>
       <w:iCs/>
@@ -1157,7 +1438,7 @@
     <w:link w:val="IntenseQuoteChar"/>
     <w:uiPriority w:val="30"/>
     <w:qFormat/>
-    <w:rsid w:val="00CD6AB7"/>
+    <w:rsid w:val="00DC4C52"/>
     <w:pPr>
       <w:pBdr>
         <w:top w:val="single" w:sz="4" w:space="10" w:color="0F4761" w:themeColor="accent1" w:themeShade="BF"/>
@@ -1178,7 +1459,7 @@
     <w:basedOn w:val="DefaultParagraphFont"/>
     <w:link w:val="IntenseQuote"/>
     <w:uiPriority w:val="30"/>
-    <w:rsid w:val="00CD6AB7"/>
+    <w:rsid w:val="00DC4C52"/>
     <w:rPr>
       <w:i/>
       <w:iCs/>
@@ -1190,7 +1471,7 @@
     <w:basedOn w:val="DefaultParagraphFont"/>
     <w:uiPriority w:val="32"/>
     <w:qFormat/>
-    <w:rsid w:val="00CD6AB7"/>
+    <w:rsid w:val="00DC4C52"/>
     <w:rPr>
       <w:b/>
       <w:bCs/>

</xml_diff>